<commit_message>
removing address after scam
</commit_message>
<xml_diff>
--- a/resume-Marcel-Quirijnen.docx
+++ b/resume-Marcel-Quirijnen.docx
@@ -54,10 +54,25 @@
       <w:r>
         <w:rPr>
           <w:rFonts w:cs="Verdana" w:ascii="Arial" w:hAnsi="Arial"/>
-          <w:sz w:val="22"/>
-          <w:szCs w:val="22"/>
-        </w:rPr>
-        <w:t>368 N Kingshighway, Sikeston, MO 63801</w:t>
+          <w:sz w:val="20"/>
+          <w:szCs w:val="20"/>
+        </w:rPr>
+        <w:t xml:space="preserve">Greater St. Louis Area - Open to hybrid in St. Louis, Kansas City, Memphis, Nashville, </w:t>
+      </w:r>
+      <w:r>
+        <w:rPr>
+          <w:rFonts w:cs="Verdana" w:ascii="Arial" w:hAnsi="Arial"/>
+          <w:sz w:val="20"/>
+          <w:szCs w:val="20"/>
+        </w:rPr>
+        <w:t>Louisville</w:t>
+      </w:r>
+      <w:r>
+        <w:rPr>
+          <w:rFonts w:cs="Verdana" w:ascii="Arial" w:hAnsi="Arial"/>
+          <w:sz w:val="22"/>
+          <w:szCs w:val="22"/>
+        </w:rPr>
         <w:br/>
       </w:r>
     </w:p>
@@ -1065,29 +1080,7 @@
           <w:sz w:val="22"/>
           <w:szCs w:val="22"/>
         </w:rPr>
-        <w:t xml:space="preserve">Improve, debug and refine code for prompt-based </w:t>
-      </w:r>
-      <w:r>
-        <w:rPr>
-          <w:rStyle w:val="Emphasis"/>
-          <w:rFonts w:ascii="Arial" w:hAnsi="Arial"/>
-          <w:i w:val="false"/>
-          <w:iCs w:val="false"/>
-          <w:sz w:val="22"/>
-          <w:szCs w:val="22"/>
-        </w:rPr>
-        <w:t xml:space="preserve">code </w:t>
-      </w:r>
-      <w:r>
-        <w:rPr>
-          <w:rStyle w:val="Emphasis"/>
-          <w:rFonts w:ascii="Arial" w:hAnsi="Arial"/>
-          <w:i w:val="false"/>
-          <w:iCs w:val="false"/>
-          <w:sz w:val="22"/>
-          <w:szCs w:val="22"/>
-        </w:rPr>
-        <w:t>generation using Python, shell scripts or Java</w:t>
+        <w:t>Improve, debug and refine code for prompt-based code generation using Python, shell scripts or Java</w:t>
       </w:r>
     </w:p>
     <w:p>
@@ -2124,9 +2117,9 @@
         </w:rPr>
         <w:t>Python 3</w:t>
       </w:r>
-      <w:bookmarkStart w:id="0" w:name="__DdeLink__490_389016543_Copy_1"/>
+      <w:bookmarkStart w:id="0" w:name="__DdeLink__493_389016543_Copy_1"/>
       <w:bookmarkStart w:id="1" w:name="__DdeLink__511_1401846983_Copy_1"/>
-      <w:bookmarkStart w:id="2" w:name="__DdeLink__493_389016543_Copy_1"/>
+      <w:bookmarkStart w:id="2" w:name="__DdeLink__490_389016543_Copy_1"/>
       <w:bookmarkEnd w:id="0"/>
       <w:bookmarkEnd w:id="1"/>
       <w:bookmarkEnd w:id="2"/>

</xml_diff>